<commit_message>
Add Logistics and Transportation industry page, strategy doc and route shader
Refactored /industries/logistics-it-solutions (same URL and page name as the
live site) from the Phase 1 strategy doc: two-line H1, results chips, soft
route-network shader with an animated freight visual, direct answer, 4 focus
areas with in-production proof (Arrive Logistics EDI and load platforms,
fleet apps, AI document extraction), how every TEAM solution applies to
logistics, current success stories (unchanged), animated HowTo, delivery
model, FAQ and JSON-LD. Marked internal in lib/industries.ts.

Also corrects the healthcare strategy doc: the hub's 63% figure comes from
the freight-forwarder AI project, not Lovelace.

Co-Authored-By: Claude Opus 5.5 <noreply@anthropic.com>
Claude-Session: https://claude.ai/code/session_013wwRamYmoaCu2Jj7xRXZqL
</commit_message>
<xml_diff>
--- a/docs/Healthcare-Wellness-Industry-Strategy.docx
+++ b/docs/Healthcare-Wellness-Industry-Strategy.docx
@@ -117,7 +117,7 @@
         </w:rPr>
         <w:t xml:space="preserve">Page: </w:t>
       </w:r>
-      <w:hyperlink w:history="1" r:id="rIddic_8wl46un2yrix3mbj3">
+      <w:hyperlink w:history="1" r:id="rIdjqiu_antiaancjpt9xija">
         <w:r>
           <w:rPr>
             <w:rFonts w:ascii="Aptos" w:cs="Aptos" w:eastAsia="Aptos" w:hAnsi="Aptos"/>
@@ -4846,7 +4846,7 @@
           <w:sz w:val="21"/>
           <w:szCs w:val="21"/>
         </w:rPr>
-        <w:t xml:space="preserve">Hub open item resolved: </w:t>
+        <w:t xml:space="preserve">Note on the hub: </w:t>
       </w:r>
       <w:r>
         <w:rPr>
@@ -4855,7 +4855,7 @@
           <w:sz w:val="21"/>
           <w:szCs w:val="21"/>
         </w:rPr>
-        <w:t xml:space="preserve">the hub's "63% lower operating costs" comes from Lovelace's published "Cost per Registry reduced by 63 percent". The hub wording should say "63% lower cost per registry".</w:t>
+        <w:t xml:space="preserve">Lovelace's published 63% is a lower cost per registry. The hub's "63% lower operating costs" is a different result (a freight forwarder's AI document extraction, see the logistics strategy), so the two must not be mixed.</w:t>
       </w:r>
     </w:p>
     <w:p>
@@ -21175,36 +21175,6 @@
           <w:sz w:val="21"/>
           <w:szCs w:val="21"/>
         </w:rPr>
-        <w:t xml:space="preserve">Hub fix:</w:t>
-      </w:r>
-      <w:r>
-        <w:rPr>
-          <w:rFonts w:ascii="Aptos" w:cs="Aptos" w:eastAsia="Aptos" w:hAnsi="Aptos"/>
-          <w:color w:val="2F282D"/>
-          <w:sz w:val="21"/>
-          <w:szCs w:val="21"/>
-        </w:rPr>
-        <w:t xml:space="preserve"> change the hub's "63% lower operating costs" to "63% lower cost per registry (Lovelace)".</w:t>
-      </w:r>
-    </w:p>
-    <w:p>
-      <w:pPr>
-        <w:pStyle w:val="ListParagraph"/>
-        <w:numPr>
-          <w:ilvl w:val="0"/>
-          <w:numId w:val="5"/>
-        </w:numPr>
-        <w:spacing w:after="80" w:line="276"/>
-      </w:pPr>
-      <w:r>
-        <w:rPr>
-          <w:rFonts w:ascii="Aptos" w:cs="Aptos" w:eastAsia="Aptos" w:hAnsi="Aptos"/>
-          <w:b/>
-          <w:bCs/>
-          <w:color w:val="2F282D"/>
-          <w:sz w:val="21"/>
-          <w:szCs w:val="21"/>
-        </w:rPr>
         <w:t xml:space="preserve">New case studies:</w:t>
       </w:r>
       <w:r>
@@ -21321,7 +21291,7 @@
         </w:numPr>
         <w:spacing w:after="80"/>
       </w:pPr>
-      <w:hyperlink w:history="1" r:id="rId3e66_lhb4brm3ltqfiqoc">
+      <w:hyperlink w:history="1" r:id="rIdt5_agk804e5phjcm4kvxr">
         <w:r>
           <w:rPr>
             <w:rFonts w:ascii="Aptos" w:cs="Aptos" w:eastAsia="Aptos" w:hAnsi="Aptos"/>
@@ -21343,7 +21313,7 @@
         </w:numPr>
         <w:spacing w:after="80"/>
       </w:pPr>
-      <w:hyperlink w:history="1" r:id="rIdyfdusgk-3izn13z3pontj">
+      <w:hyperlink w:history="1" r:id="rIdzrzf7bammuxrofb17cpew">
         <w:r>
           <w:rPr>
             <w:rFonts w:ascii="Aptos" w:cs="Aptos" w:eastAsia="Aptos" w:hAnsi="Aptos"/>
@@ -21365,7 +21335,7 @@
         </w:numPr>
         <w:spacing w:after="80"/>
       </w:pPr>
-      <w:hyperlink w:history="1" r:id="rId_n7rfi54qwvgmyoexa6_h">
+      <w:hyperlink w:history="1" r:id="rIdyiiz-plc2xt9kkbv5zmdp">
         <w:r>
           <w:rPr>
             <w:rFonts w:ascii="Aptos" w:cs="Aptos" w:eastAsia="Aptos" w:hAnsi="Aptos"/>
@@ -21387,7 +21357,7 @@
         </w:numPr>
         <w:spacing w:after="80"/>
       </w:pPr>
-      <w:hyperlink w:history="1" r:id="rIdqp7zqlit_swyph2jcjoo7">
+      <w:hyperlink w:history="1" r:id="rIdwzae9fe6utfkzeaw3qstz">
         <w:r>
           <w:rPr>
             <w:rFonts w:ascii="Aptos" w:cs="Aptos" w:eastAsia="Aptos" w:hAnsi="Aptos"/>
@@ -21409,7 +21379,7 @@
         </w:numPr>
         <w:spacing w:after="80"/>
       </w:pPr>
-      <w:hyperlink w:history="1" r:id="rIdvlwmptxp4wsw2ikb8hyfq">
+      <w:hyperlink w:history="1" r:id="rIdlxybyiymb9eeggdj7muyi">
         <w:r>
           <w:rPr>
             <w:rFonts w:ascii="Aptos" w:cs="Aptos" w:eastAsia="Aptos" w:hAnsi="Aptos"/>
@@ -21431,7 +21401,7 @@
         </w:numPr>
         <w:spacing w:after="80"/>
       </w:pPr>
-      <w:hyperlink w:history="1" r:id="rIdxynmbifxggrkmiqripym7">
+      <w:hyperlink w:history="1" r:id="rIdbcsnvr076bu0nkwwmr_eh">
         <w:r>
           <w:rPr>
             <w:rFonts w:ascii="Aptos" w:cs="Aptos" w:eastAsia="Aptos" w:hAnsi="Aptos"/>

</xml_diff>